<commit_message>
LessonForge sources overhaul: types, Gemini multimodal, sources/links APIs, DOCX inline markers, client extraction, workspace type fix
</commit_message>
<xml_diff>
--- a/public/template-official-tagged.docx
+++ b/public/template-official-tagged.docx
@@ -102,7 +102,7 @@
                 <w:i/>
                 <w:iCs/>
               </w:rPr>
-              <w:t>Lesson Title</w:t>
+              <w:t>Date:</w:t>
             </w:r>
           </w:p>
         </w:tc>
@@ -116,6 +116,52 @@
             </w:tcBorders>
             <w:vAlign w:val="center"/>
           </w:tcPr>
+          <w:p>
+            <w:r>
+              <w:t>{{LF_DATE}}</w:t>
+            </w:r>
+          </w:p>
+        </w:tc>
+      </w:tr>
+      <w:tr>
+        <w:trPr>
+          <w:trHeight w:val="440"/>
+        </w:trPr>
+        <w:tc>
+          <w:tcPr>
+            <w:tcW w:w="3855" w:type="dxa"/>
+            <w:tcBorders>
+              <w:top w:val="single" w:sz="12" w:space="0" w:color="000000"/>
+              <w:left w:val="single" w:sz="12" w:space="0" w:color="000000"/>
+              <w:right w:val="dashed" w:sz="8" w:space="0" w:color="000000"/>
+            </w:tcBorders>
+            <w:vAlign w:val="center"/>
+          </w:tcPr>
+          <w:p>
+            <w:pPr>
+              <w:widowControl w:val="0"/>
+              <w:spacing w:line="240" w:lineRule="auto"/>
+              <w:rPr>
+                <w:rFonts w:ascii="Montserrat" w:eastAsia="Montserrat" w:hAnsi="Montserrat" w:cs="Montserrat"/>
+                <w:b/>
+                <w:bCs/>
+                <w:i/>
+                <w:iCs/>
+              </w:rPr>
+            </w:pPr>
+            <w:r>
+              <w:rPr>
+                <w:rFonts w:ascii="Montserrat" w:eastAsia="Montserrat" w:hAnsi="Montserrat" w:cs="Montserrat"/>
+                <w:b/>
+                <w:bCs/>
+                <w:i/>
+                <w:iCs/>
+              </w:rPr>
+              <w:t>Name of Teacher/s</w:t>
+            </w:r>
+          </w:p>
+        </w:tc>
+        <w:tc>
           <w:tcPr>
             <w:tcW w:w="9345" w:type="dxa"/>
             <w:tcBorders>
@@ -127,7 +173,62 @@
           </w:tcPr>
           <w:p>
             <w:r>
-              <w:t xml:space="preserve">{{LF_TITLE}}</w:t>
+              <w:t>{{LF_TEACHERS}}</w:t>
+            </w:r>
+          </w:p>
+        </w:tc>
+      </w:tr>
+      <w:tr>
+        <w:trPr>
+          <w:trHeight w:val="440"/>
+        </w:trPr>
+        <w:tc>
+          <w:tcPr>
+            <w:tcW w:w="3855" w:type="dxa"/>
+            <w:tcBorders>
+              <w:top w:val="single" w:sz="12" w:space="0" w:color="000000"/>
+              <w:left w:val="single" w:sz="12" w:space="0" w:color="000000"/>
+              <w:right w:val="dashed" w:sz="8" w:space="0" w:color="000000"/>
+            </w:tcBorders>
+            <w:vAlign w:val="center"/>
+          </w:tcPr>
+          <w:p>
+            <w:pPr>
+              <w:widowControl w:val="0"/>
+              <w:spacing w:line="240" w:lineRule="auto"/>
+              <w:rPr>
+                <w:rFonts w:ascii="Montserrat" w:eastAsia="Montserrat" w:hAnsi="Montserrat" w:cs="Montserrat"/>
+                <w:b/>
+                <w:bCs/>
+                <w:i/>
+                <w:iCs/>
+              </w:rPr>
+            </w:pPr>
+            <w:r>
+              <w:rPr>
+                <w:rFonts w:ascii="Montserrat" w:eastAsia="Montserrat" w:hAnsi="Montserrat" w:cs="Montserrat"/>
+                <w:b/>
+                <w:bCs/>
+                <w:i/>
+                <w:iCs/>
+              </w:rPr>
+              <w:t>Lesson Title</w:t>
+            </w:r>
+          </w:p>
+        </w:tc>
+        <w:tc>
+          <w:tcPr>
+            <w:tcW w:w="9345" w:type="dxa"/>
+            <w:tcBorders>
+              <w:top w:val="single" w:sz="12" w:space="0" w:color="000000"/>
+              <w:left w:val="dashed" w:sz="8" w:space="0" w:color="000000"/>
+              <w:right w:val="single" w:sz="12" w:space="0" w:color="000000"/>
+            </w:tcBorders>
+            <w:vAlign w:val="center"/>
+          </w:tcPr>
+          <w:p>
+            <w:r>
+              <w:t>{{LF_TITLE}}</w:t>
             </w:r>
           </w:p>
         </w:tc>
@@ -178,17 +279,9 @@
             </w:tcBorders>
             <w:vAlign w:val="center"/>
           </w:tcPr>
-          <w:tcPr>
-            <w:tcW w:w="9345" w:type="dxa"/>
-            <w:tcBorders>
-              <w:left w:val="dashed" w:sz="8" w:space="0" w:color="000000"/>
-              <w:right w:val="single" w:sz="12" w:space="0" w:color="000000"/>
-            </w:tcBorders>
-            <w:vAlign w:val="center"/>
-          </w:tcPr>
-          <w:p>
-            <w:r>
-              <w:t xml:space="preserve">{{LF_LEARNING_AREA}}</w:t>
+          <w:p>
+            <w:r>
+              <w:t>{{LF_LEARNING_AREA}}</w:t>
             </w:r>
           </w:p>
         </w:tc>
@@ -226,7 +319,7 @@
                 <w:i/>
                 <w:iCs/>
               </w:rPr>
-              <w:t>Name of Teacher/s</w:t>
+              <w:t>Grade Level and Section</w:t>
             </w:r>
           </w:p>
         </w:tc>
@@ -239,17 +332,9 @@
             </w:tcBorders>
             <w:vAlign w:val="center"/>
           </w:tcPr>
-          <w:tcPr>
-            <w:tcW w:w="9345" w:type="dxa"/>
-            <w:tcBorders>
-              <w:left w:val="dashed" w:sz="8" w:space="0" w:color="000000"/>
-              <w:right w:val="single" w:sz="12" w:space="0" w:color="000000"/>
-            </w:tcBorders>
-            <w:vAlign w:val="center"/>
-          </w:tcPr>
-          <w:p>
-            <w:r>
-              <w:t xml:space="preserve">{{LF_TEACHERS}}</w:t>
+          <w:p>
+            <w:r>
+              <w:t>{{LF_GRADE_SECTION}}</w:t>
             </w:r>
           </w:p>
         </w:tc>
@@ -287,7 +372,7 @@
                 <w:i/>
                 <w:iCs/>
               </w:rPr>
-              <w:t>Grade Level and Section</w:t>
+              <w:t>No. of Sessions</w:t>
             </w:r>
           </w:p>
         </w:tc>
@@ -300,17 +385,9 @@
             </w:tcBorders>
             <w:vAlign w:val="center"/>
           </w:tcPr>
-          <w:tcPr>
-            <w:tcW w:w="9345" w:type="dxa"/>
-            <w:tcBorders>
-              <w:left w:val="dashed" w:sz="8" w:space="0" w:color="000000"/>
-              <w:right w:val="single" w:sz="12" w:space="0" w:color="000000"/>
-            </w:tcBorders>
-            <w:vAlign w:val="center"/>
-          </w:tcPr>
-          <w:p>
-            <w:r>
-              <w:t xml:space="preserve">{{LF_GRADE_SECTION}}</w:t>
+          <w:p>
+            <w:r>
+              <w:t>{{LF_SESSIONS}}</w:t>
             </w:r>
           </w:p>
         </w:tc>
@@ -334,67 +411,6 @@
               <w:spacing w:line="240" w:lineRule="auto"/>
               <w:rPr>
                 <w:rFonts w:ascii="Montserrat" w:eastAsia="Montserrat" w:hAnsi="Montserrat" w:cs="Montserrat"/>
-                <w:b/>
-                <w:bCs/>
-                <w:i/>
-                <w:iCs/>
-              </w:rPr>
-            </w:pPr>
-            <w:r>
-              <w:rPr>
-                <w:rFonts w:ascii="Montserrat" w:eastAsia="Montserrat" w:hAnsi="Montserrat" w:cs="Montserrat"/>
-                <w:b/>
-                <w:bCs/>
-                <w:i/>
-                <w:iCs/>
-              </w:rPr>
-              <w:t>No. of Sessions</w:t>
-            </w:r>
-          </w:p>
-        </w:tc>
-        <w:tc>
-          <w:tcPr>
-            <w:tcW w:w="9345" w:type="dxa"/>
-            <w:tcBorders>
-              <w:left w:val="dashed" w:sz="8" w:space="0" w:color="000000"/>
-              <w:right w:val="single" w:sz="12" w:space="0" w:color="000000"/>
-            </w:tcBorders>
-            <w:vAlign w:val="center"/>
-          </w:tcPr>
-          <w:tcPr>
-            <w:tcW w:w="9345" w:type="dxa"/>
-            <w:tcBorders>
-              <w:left w:val="dashed" w:sz="8" w:space="0" w:color="000000"/>
-              <w:right w:val="single" w:sz="12" w:space="0" w:color="000000"/>
-            </w:tcBorders>
-            <w:vAlign w:val="center"/>
-          </w:tcPr>
-          <w:p>
-            <w:r>
-              <w:t xml:space="preserve">{{LF_SESSIONS}}</w:t>
-            </w:r>
-          </w:p>
-        </w:tc>
-      </w:tr>
-      <w:tr>
-        <w:trPr>
-          <w:trHeight w:val="440"/>
-        </w:trPr>
-        <w:tc>
-          <w:tcPr>
-            <w:tcW w:w="3855" w:type="dxa"/>
-            <w:tcBorders>
-              <w:left w:val="single" w:sz="12" w:space="0" w:color="000000"/>
-              <w:right w:val="dashed" w:sz="8" w:space="0" w:color="000000"/>
-            </w:tcBorders>
-            <w:vAlign w:val="center"/>
-          </w:tcPr>
-          <w:p>
-            <w:pPr>
-              <w:widowControl w:val="0"/>
-              <w:spacing w:line="240" w:lineRule="auto"/>
-              <w:rPr>
-                <w:rFonts w:ascii="Montserrat" w:eastAsia="Montserrat" w:hAnsi="Montserrat" w:cs="Montserrat"/>
                 <w:i/>
                 <w:iCs/>
                 <w:sz w:val="18"/>
@@ -441,16 +457,9 @@
               <w:right w:val="single" w:sz="12" w:space="0" w:color="000000"/>
             </w:tcBorders>
           </w:tcPr>
-          <w:tcPr>
-            <w:tcW w:w="9345" w:type="dxa"/>
-            <w:tcBorders>
-              <w:left w:val="dashed" w:sz="8" w:space="0" w:color="000000"/>
-              <w:right w:val="single" w:sz="12" w:space="0" w:color="000000"/>
-            </w:tcBorders>
-          </w:tcPr>
-          <w:p>
-            <w:r>
-              <w:t xml:space="preserve">{{LF_REFERENCES}}</w:t>
+          <w:p>
+            <w:r>
+              <w:t>{{LF_REFERENCES}}</w:t>
             </w:r>
           </w:p>
         </w:tc>
@@ -577,17 +586,9 @@
               <w:right w:val="single" w:sz="12" w:space="0" w:color="000000"/>
             </w:tcBorders>
           </w:tcPr>
-          <w:tcPr>
-            <w:tcW w:w="9345" w:type="dxa"/>
-            <w:tcBorders>
-              <w:left w:val="dashed" w:sz="8" w:space="0" w:color="000000"/>
-              <w:bottom w:val="single" w:sz="12" w:space="0" w:color="000000"/>
-              <w:right w:val="single" w:sz="12" w:space="0" w:color="000000"/>
-            </w:tcBorders>
-          </w:tcPr>
-          <w:p>
-            <w:r>
-              <w:t xml:space="preserve">{{LF_AI_DECLARATION}}</w:t>
+          <w:p>
+            <w:r>
+              <w:t>{{LF_AI_DECLARATION}}</w:t>
             </w:r>
           </w:p>
         </w:tc>
@@ -767,29 +768,7 @@
                 <w:sz w:val="16"/>
                 <w:szCs w:val="16"/>
               </w:rPr>
-              <w:t>Write the competency/</w:t>
-            </w:r>
-            <w:proofErr w:type="spellStart"/>
-            <w:r>
-              <w:rPr>
-                <w:rFonts w:ascii="Montserrat" w:eastAsia="Montserrat" w:hAnsi="Montserrat" w:cs="Montserrat"/>
-                <w:i/>
-                <w:iCs/>
-                <w:sz w:val="16"/>
-                <w:szCs w:val="16"/>
-              </w:rPr>
-              <w:t>ies</w:t>
-            </w:r>
-            <w:proofErr w:type="spellEnd"/>
-            <w:r>
-              <w:rPr>
-                <w:rFonts w:ascii="Montserrat" w:eastAsia="Montserrat" w:hAnsi="Montserrat" w:cs="Montserrat"/>
-                <w:i/>
-                <w:iCs/>
-                <w:sz w:val="16"/>
-                <w:szCs w:val="16"/>
-              </w:rPr>
-              <w:t xml:space="preserve"> from the curriculum that we are targeting, and the content or performance standards applicable to the sessions.</w:t>
+              <w:t>Write the competency/ies from the curriculum that we are targeting, and the content or performance standards applicable to the sessions.</w:t>
             </w:r>
           </w:p>
         </w:tc>
@@ -803,18 +782,9 @@
               <w:right w:val="single" w:sz="12" w:space="0" w:color="000000"/>
             </w:tcBorders>
           </w:tcPr>
-          <w:tcPr>
-            <w:tcW w:w="9015" w:type="dxa"/>
-            <w:tcBorders>
-              <w:top w:val="single" w:sz="8" w:space="0" w:color="999999"/>
-              <w:left w:val="dashed" w:sz="8" w:space="0" w:color="000000"/>
-              <w:bottom w:val="single" w:sz="8" w:space="0" w:color="999999"/>
-              <w:right w:val="single" w:sz="12" w:space="0" w:color="000000"/>
-            </w:tcBorders>
-          </w:tcPr>
-          <w:p>
-            <w:r>
-              <w:t xml:space="preserve">{{LF_COMPETENCY}}</w:t>
+          <w:p>
+            <w:r>
+              <w:t>{{LF_COMPETENCY}}</w:t>
             </w:r>
           </w:p>
         </w:tc>
@@ -889,18 +859,9 @@
               <w:right w:val="single" w:sz="12" w:space="0" w:color="000000"/>
             </w:tcBorders>
           </w:tcPr>
-          <w:tcPr>
-            <w:tcW w:w="9015" w:type="dxa"/>
-            <w:tcBorders>
-              <w:top w:val="single" w:sz="8" w:space="0" w:color="999999"/>
-              <w:left w:val="dashed" w:sz="8" w:space="0" w:color="000000"/>
-              <w:bottom w:val="single" w:sz="8" w:space="0" w:color="999999"/>
-              <w:right w:val="single" w:sz="12" w:space="0" w:color="000000"/>
-            </w:tcBorders>
-          </w:tcPr>
-          <w:p>
-            <w:r>
-              <w:t xml:space="preserve">{{LF_OBJECTIVES}}</w:t>
+          <w:p>
+            <w:r>
+              <w:t>{{LF_OBJECTIVES}}</w:t>
             </w:r>
           </w:p>
         </w:tc>
@@ -972,18 +933,9 @@
               <w:right w:val="single" w:sz="12" w:space="0" w:color="000000"/>
             </w:tcBorders>
           </w:tcPr>
-          <w:tcPr>
-            <w:tcW w:w="9015" w:type="dxa"/>
-            <w:tcBorders>
-              <w:top w:val="single" w:sz="8" w:space="0" w:color="999999"/>
-              <w:left w:val="dashed" w:sz="8" w:space="0" w:color="000000"/>
-              <w:bottom w:val="single" w:sz="12" w:space="0" w:color="000000"/>
-              <w:right w:val="single" w:sz="12" w:space="0" w:color="000000"/>
-            </w:tcBorders>
-          </w:tcPr>
-          <w:p>
-            <w:r>
-              <w:t xml:space="preserve">{{LF_LEARNER_CONTEXT}}</w:t>
+          <w:p>
+            <w:r>
+              <w:t>{{LF_LEARNER_CONTEXT}}</w:t>
             </w:r>
           </w:p>
         </w:tc>
@@ -1082,25 +1034,7 @@
                 <w:sz w:val="18"/>
                 <w:szCs w:val="18"/>
               </w:rPr>
-              <w:t xml:space="preserve">A learning experience is like a thoughtfully designed journey. Each activity and interaction </w:t>
-            </w:r>
-            <w:proofErr w:type="gramStart"/>
-            <w:r>
-              <w:rPr>
-                <w:rFonts w:ascii="Montserrat" w:eastAsia="Montserrat" w:hAnsi="Montserrat" w:cs="Montserrat"/>
-                <w:sz w:val="18"/>
-                <w:szCs w:val="18"/>
-              </w:rPr>
-              <w:t>builds</w:t>
-            </w:r>
-            <w:proofErr w:type="gramEnd"/>
-            <w:r>
-              <w:rPr>
-                <w:rFonts w:ascii="Montserrat" w:eastAsia="Montserrat" w:hAnsi="Montserrat" w:cs="Montserrat"/>
-                <w:sz w:val="18"/>
-                <w:szCs w:val="18"/>
-              </w:rPr>
-              <w:t xml:space="preserve"> towards meaningful understanding and growth. Identify activities and interactions to help learners gain knowledge, skills, or understanding in a purposeful way.</w:t>
+              <w:t>A learning experience is like a thoughtfully designed journey. Each activity and interaction builds towards meaningful understanding and growth. Identify activities and interactions to help learners gain knowledge, skills, or understanding in a purposeful way.</w:t>
             </w:r>
           </w:p>
         </w:tc>
@@ -1169,16 +1103,9 @@
               <w:left w:val="dashed" w:sz="8" w:space="0" w:color="000000"/>
             </w:tcBorders>
           </w:tcPr>
-          <w:tcPr>
-            <w:tcW w:w="9000" w:type="dxa"/>
-            <w:tcBorders>
-              <w:top w:val="single" w:sz="8" w:space="0" w:color="999999"/>
-              <w:left w:val="dashed" w:sz="8" w:space="0" w:color="000000"/>
-            </w:tcBorders>
-          </w:tcPr>
-          <w:p>
-            <w:r>
-              <w:t xml:space="preserve">{{LF_PRE_LESSON}}</w:t>
+          <w:p>
+            <w:r>
+              <w:t>{{LF_PRE_LESSON}}</w:t>
             </w:r>
           </w:p>
         </w:tc>
@@ -1448,29 +1375,7 @@
                 <w:sz w:val="16"/>
                 <w:szCs w:val="16"/>
               </w:rPr>
-              <w:t xml:space="preserve">invite learners to reflect on why </w:t>
-            </w:r>
-            <w:proofErr w:type="gramStart"/>
-            <w:r>
-              <w:rPr>
-                <w:rFonts w:ascii="Montserrat" w:eastAsia="Montserrat" w:hAnsi="Montserrat" w:cs="Montserrat"/>
-                <w:i/>
-                <w:iCs/>
-                <w:sz w:val="16"/>
-                <w:szCs w:val="16"/>
-              </w:rPr>
-              <w:t>this matters</w:t>
-            </w:r>
-            <w:proofErr w:type="gramEnd"/>
-            <w:r>
-              <w:rPr>
-                <w:rFonts w:ascii="Montserrat" w:eastAsia="Montserrat" w:hAnsi="Montserrat" w:cs="Montserrat"/>
-                <w:i/>
-                <w:iCs/>
-                <w:sz w:val="16"/>
-                <w:szCs w:val="16"/>
-              </w:rPr>
-              <w:t xml:space="preserve"> to them</w:t>
+              <w:t>invite learners to reflect on why this matters to them</w:t>
             </w:r>
           </w:p>
           <w:p>
@@ -1509,15 +1414,9 @@
               <w:left w:val="dashed" w:sz="8" w:space="0" w:color="000000"/>
             </w:tcBorders>
           </w:tcPr>
-          <w:tcPr>
-            <w:tcW w:w="9000" w:type="dxa"/>
-            <w:tcBorders>
-              <w:left w:val="dashed" w:sz="8" w:space="0" w:color="000000"/>
-            </w:tcBorders>
-          </w:tcPr>
-          <w:p>
-            <w:r>
-              <w:t xml:space="preserve">{{LF_FLOW}}</w:t>
+          <w:p>
+            <w:r>
+              <w:t>{{LF_FLOW}}</w:t>
             </w:r>
           </w:p>
         </w:tc>
@@ -1627,15 +1526,9 @@
               <w:left w:val="dashed" w:sz="8" w:space="0" w:color="000000"/>
             </w:tcBorders>
           </w:tcPr>
-          <w:tcPr>
-            <w:tcW w:w="9000" w:type="dxa"/>
-            <w:tcBorders>
-              <w:left w:val="dashed" w:sz="8" w:space="0" w:color="000000"/>
-            </w:tcBorders>
-          </w:tcPr>
-          <w:p>
-            <w:r>
-              <w:t xml:space="preserve">{{LF_RESOURCES}}</w:t>
+          <w:p>
+            <w:r>
+              <w:t>{{LF_RESOURCES}}</w:t>
             </w:r>
           </w:p>
         </w:tc>
@@ -1704,16 +1597,9 @@
               <w:bottom w:val="single" w:sz="12" w:space="0" w:color="000000"/>
             </w:tcBorders>
           </w:tcPr>
-          <w:tcPr>
-            <w:tcW w:w="9000" w:type="dxa"/>
-            <w:tcBorders>
-              <w:left w:val="dashed" w:sz="8" w:space="0" w:color="000000"/>
-              <w:bottom w:val="single" w:sz="12" w:space="0" w:color="000000"/>
-            </w:tcBorders>
-          </w:tcPr>
-          <w:p>
-            <w:r>
-              <w:t xml:space="preserve">{{LF_INTEGRATION}}</w:t>
+          <w:p>
+            <w:r>
+              <w:t>{{LF_INTEGRATION}}</w:t>
             </w:r>
           </w:p>
         </w:tc>
@@ -1948,17 +1834,9 @@
               <w:bottom w:val="single" w:sz="12" w:space="0" w:color="000000"/>
             </w:tcBorders>
           </w:tcPr>
-          <w:tcPr>
-            <w:tcW w:w="9255" w:type="dxa"/>
-            <w:tcBorders>
-              <w:top w:val="single" w:sz="8" w:space="0" w:color="999999"/>
-              <w:left w:val="dashed" w:sz="8" w:space="0" w:color="000000"/>
-              <w:bottom w:val="single" w:sz="12" w:space="0" w:color="000000"/>
-            </w:tcBorders>
-          </w:tcPr>
-          <w:p>
-            <w:r>
-              <w:t xml:space="preserve">{{LF_FORMATIVE_ASSESSMENT}}</w:t>
+          <w:p>
+            <w:r>
+              <w:t>{{LF_FORMATIVE_ASSESSMENT}}</w:t>
             </w:r>
           </w:p>
         </w:tc>
@@ -2152,16 +2030,9 @@
               <w:left w:val="dashed" w:sz="8" w:space="0" w:color="000000"/>
             </w:tcBorders>
           </w:tcPr>
-          <w:tcPr>
-            <w:tcW w:w="9285" w:type="dxa"/>
-            <w:tcBorders>
-              <w:top w:val="single" w:sz="8" w:space="0" w:color="999999"/>
-              <w:left w:val="dashed" w:sz="8" w:space="0" w:color="000000"/>
-            </w:tcBorders>
-          </w:tcPr>
-          <w:p>
-            <w:r>
-              <w:t xml:space="preserve">{{LF_EXTENDED}}</w:t>
+          <w:p>
+            <w:r>
+              <w:t>{{LF_EXTENDED}}</w:t>
             </w:r>
           </w:p>
         </w:tc>
@@ -2276,16 +2147,9 @@
               <w:bottom w:val="single" w:sz="12" w:space="0" w:color="000000"/>
             </w:tcBorders>
           </w:tcPr>
-          <w:tcPr>
-            <w:tcW w:w="9285" w:type="dxa"/>
-            <w:tcBorders>
-              <w:left w:val="dashed" w:sz="8" w:space="0" w:color="000000"/>
-              <w:bottom w:val="single" w:sz="12" w:space="0" w:color="000000"/>
-            </w:tcBorders>
-          </w:tcPr>
-          <w:p>
-            <w:r>
-              <w:t xml:space="preserve">{{LF_REFLECTIONS}}</w:t>
+          <w:p>
+            <w:r>
+              <w:t>{{LF_REFLECTIONS}}</w:t>
             </w:r>
           </w:p>
         </w:tc>
@@ -2368,7 +2232,7 @@
           <w:b/>
           <w:bCs/>
         </w:rPr>
-        <w:t>NAME OF TEACHER</w:t>
+        <w:t>{{LF_PREPARED_BY}}</w:t>
       </w:r>
     </w:p>
     <w:p>
@@ -2381,7 +2245,7 @@
         <w:rPr>
           <w:rFonts w:ascii="Montserrat" w:eastAsia="Montserrat" w:hAnsi="Montserrat" w:cs="Montserrat"/>
         </w:rPr>
-        <w:t>Position</w:t>
+        <w:t>{{LF_POSITION}}</w:t>
       </w:r>
     </w:p>
     <w:p>

</xml_diff>

<commit_message>
feat: add checkedBy/checkedByPosition/notedBy/notedByPosition fields for flexible signatories
</commit_message>
<xml_diff>
--- a/public/template-official-tagged.docx
+++ b/public/template-official-tagged.docx
@@ -768,7 +768,29 @@
                 <w:sz w:val="16"/>
                 <w:szCs w:val="16"/>
               </w:rPr>
-              <w:t>Write the competency/ies from the curriculum that we are targeting, and the content or performance standards applicable to the sessions.</w:t>
+              <w:t>Write the competency/</w:t>
+            </w:r>
+            <w:proofErr w:type="spellStart"/>
+            <w:r>
+              <w:rPr>
+                <w:rFonts w:ascii="Montserrat" w:eastAsia="Montserrat" w:hAnsi="Montserrat" w:cs="Montserrat"/>
+                <w:i/>
+                <w:iCs/>
+                <w:sz w:val="16"/>
+                <w:szCs w:val="16"/>
+              </w:rPr>
+              <w:t>ies</w:t>
+            </w:r>
+            <w:proofErr w:type="spellEnd"/>
+            <w:r>
+              <w:rPr>
+                <w:rFonts w:ascii="Montserrat" w:eastAsia="Montserrat" w:hAnsi="Montserrat" w:cs="Montserrat"/>
+                <w:i/>
+                <w:iCs/>
+                <w:sz w:val="16"/>
+                <w:szCs w:val="16"/>
+              </w:rPr>
+              <w:t xml:space="preserve"> from the curriculum that we are targeting, and the content or performance standards applicable to the sessions.</w:t>
             </w:r>
           </w:p>
         </w:tc>
@@ -2365,7 +2387,7 @@
           <w:b/>
           <w:bCs/>
         </w:rPr>
-        <w:t>ROWENA T. ULALAN PhD.</w:t>
+        <w:t>{{LF_CHECKED_BY}}</w:t>
       </w:r>
       <w:r>
         <w:rPr>
@@ -2430,7 +2452,22 @@
           <w:bCs/>
         </w:rPr>
         <w:tab/>
-        <w:t>MARVIN A. BATOY</w:t>
+      </w:r>
+      <w:r>
+        <w:rPr>
+          <w:rFonts w:ascii="Montserrat" w:eastAsia="Montserrat" w:hAnsi="Montserrat" w:cs="Montserrat"/>
+          <w:b/>
+          <w:bCs/>
+        </w:rPr>
+        <w:tab/>
+      </w:r>
+      <w:r>
+        <w:rPr>
+          <w:rFonts w:ascii="Montserrat" w:eastAsia="Montserrat" w:hAnsi="Montserrat" w:cs="Montserrat"/>
+          <w:b/>
+          <w:bCs/>
+        </w:rPr>
+        <w:t>{{LF_NOTED_BY}}</w:t>
       </w:r>
     </w:p>
     <w:p>
@@ -2443,7 +2480,7 @@
         <w:rPr>
           <w:rFonts w:ascii="Montserrat" w:eastAsia="Montserrat" w:hAnsi="Montserrat" w:cs="Montserrat"/>
         </w:rPr>
-        <w:t>Asst. School Principal II</w:t>
+        <w:t>{{LF_CHECKED_BY_POSITION}}</w:t>
       </w:r>
       <w:r>
         <w:rPr>
@@ -2497,8 +2534,7 @@
         <w:rPr>
           <w:rFonts w:ascii="Montserrat" w:eastAsia="Montserrat" w:hAnsi="Montserrat" w:cs="Montserrat"/>
         </w:rPr>
-        <w:tab/>
-        <w:t>School Principal II</w:t>
+        <w:t>{{LF_NOTED_BY_POSITION}}</w:t>
       </w:r>
     </w:p>
     <w:p>

</xml_diff>